<commit_message>
Add Hindi satire answers to source chapters
Co-authored-by: arena-agent <297053741+arena-agent@users.noreply.github.com>
</commit_message>
<xml_diff>
--- a/19.मिलावटी खाओ, ऐंटीबॉडीज बढ़ाओ.docx
+++ b/19.मिलावटी खाओ, ऐंटीबॉडीज बढ़ाओ.docx
@@ -172,23 +172,30 @@
     </w:p>
     <w:p>
       <w:pPr>
-        <w:jc w:val="center"/>
-        <w:rPr>
-          <w:rFonts w:cs="Mangal"/>
-          <w:b/>
-          <w:bCs/>
-          <w:szCs w:val="24"/>
-        </w:rPr>
+        <w:spacing w:after="0"/>
+        <w:jc w:val="both"/>
       </w:pPr>
       <w:r>
         <w:rPr>
-          <w:rFonts w:cs="Mangal"/>
-          <w:b/>
-          <w:bCs/>
-          <w:szCs w:val="24"/>
-          <w:cs/>
-        </w:rPr>
-        <w:t xml:space="preserve">मिलावटी खाओ </w:t>
+          <w:rFonts w:ascii="Mangal" w:hAnsi="Mangal" w:cs="Mangal" w:eastAsia="Mangal"/>
+          <w:b/>
+          <w:sz w:val="24"/>
+        </w:rPr>
+        <w:t>शीर्षक पाठ की व्यंग्यात्मकता को संक्षेप में स्पष्ट कीजिए</w:t>
+      </w:r>
+    </w:p>
+    <w:p>
+      <w:pPr>
+        <w:spacing w:after="0"/>
+        <w:jc w:val="both"/>
+      </w:pPr>
+      <w:r>
+        <w:rPr>
+          <w:rFonts w:ascii="Mangal" w:hAnsi="Mangal" w:cs="Mangal" w:eastAsia="Mangal"/>
+          <w:b w:val="0"/>
+          <w:sz w:val="24"/>
+        </w:rPr>
+        <w:t>लेखक मिलावटखोर की आवाज़ में मिलावट को देशहित, रोग-प्रतिरोधक क्षमता और वैज्ञानिक प्रमाण का नाम देने की विडंबना रचते हैं। टीकों के मिश्रण पर आई खबर का सहारा लेकर खाद्य पदार्थों में मिलावट को जायज़ ठहराना विज्ञान के मनमाने उपयोग और मुनाफे को राष्ट्रसेवा बताने पर व्यंग्य है। रचना का संकेत स्पष्ट है: खाद्य सुरक्षा, सत्यनिष्ठा और उपभोक्ता-हित को खोखले देशभक्ति-दावों से ऊपर रखा जाए।</w:t>
       </w:r>
     </w:p>
     <w:p>
@@ -209,821 +216,7 @@
           <w:szCs w:val="24"/>
           <w:cs/>
         </w:rPr>
-        <w:t>१.</w:t>
-      </w:r>
-      <w:r>
-        <w:rPr>
-          <w:rFonts w:ascii="Arial" w:hAnsi="Arial" w:cs="Arial" w:hint="cs"/>
-          <w:b/>
-          <w:bCs/>
-          <w:szCs w:val="24"/>
-          <w:cs/>
-        </w:rPr>
-        <w:t>”</w:t>
-      </w:r>
-      <w:r>
-        <w:rPr>
-          <w:rFonts w:cs="Mangal" w:hint="cs"/>
-          <w:b/>
-          <w:bCs/>
-          <w:szCs w:val="24"/>
-          <w:cs/>
-        </w:rPr>
-        <w:t>बबुआ</w:t>
-      </w:r>
-      <w:r>
-        <w:rPr>
-          <w:rFonts w:cs="Mangal"/>
-          <w:b/>
-          <w:bCs/>
-          <w:szCs w:val="24"/>
-          <w:cs/>
-        </w:rPr>
-        <w:t xml:space="preserve"> !</w:t>
-      </w:r>
-      <w:r>
-        <w:rPr>
-          <w:rFonts w:cs="Mangal" w:hint="cs"/>
-          <w:b/>
-          <w:bCs/>
-          <w:szCs w:val="24"/>
-          <w:cs/>
-        </w:rPr>
-        <w:t>जो</w:t>
-      </w:r>
-      <w:r>
-        <w:rPr>
-          <w:rFonts w:cs="Mangal"/>
-          <w:b/>
-          <w:bCs/>
-          <w:szCs w:val="24"/>
-          <w:cs/>
-        </w:rPr>
-        <w:t xml:space="preserve"> </w:t>
-      </w:r>
-      <w:r>
-        <w:rPr>
-          <w:rFonts w:cs="Mangal" w:hint="cs"/>
-          <w:b/>
-          <w:bCs/>
-          <w:szCs w:val="24"/>
-          <w:cs/>
-        </w:rPr>
-        <w:t>सच</w:t>
-      </w:r>
-      <w:r>
-        <w:rPr>
-          <w:rFonts w:cs="Mangal"/>
-          <w:b/>
-          <w:bCs/>
-          <w:szCs w:val="24"/>
-          <w:cs/>
-        </w:rPr>
-        <w:t xml:space="preserve"> </w:t>
-      </w:r>
-      <w:proofErr w:type="spellStart"/>
-      <w:r>
-        <w:rPr>
-          <w:rFonts w:cs="Mangal" w:hint="cs"/>
-          <w:b/>
-          <w:bCs/>
-          <w:szCs w:val="24"/>
-          <w:cs/>
-        </w:rPr>
-        <w:t>हैजो</w:t>
-      </w:r>
-      <w:proofErr w:type="spellEnd"/>
-      <w:r>
-        <w:rPr>
-          <w:rFonts w:cs="Mangal"/>
-          <w:b/>
-          <w:bCs/>
-          <w:szCs w:val="24"/>
-          <w:cs/>
-        </w:rPr>
-        <w:t xml:space="preserve"> </w:t>
-      </w:r>
-      <w:r>
-        <w:rPr>
-          <w:rFonts w:cs="Mangal" w:hint="cs"/>
-          <w:b/>
-          <w:bCs/>
-          <w:szCs w:val="24"/>
-          <w:cs/>
-        </w:rPr>
-        <w:t>सच</w:t>
-      </w:r>
-      <w:r>
-        <w:rPr>
-          <w:rFonts w:cs="Mangal"/>
-          <w:b/>
-          <w:bCs/>
-          <w:szCs w:val="24"/>
-          <w:cs/>
-        </w:rPr>
-        <w:t xml:space="preserve"> </w:t>
-      </w:r>
-      <w:proofErr w:type="spellStart"/>
-      <w:r>
-        <w:rPr>
-          <w:rFonts w:cs="Mangal" w:hint="cs"/>
-          <w:b/>
-          <w:bCs/>
-          <w:szCs w:val="24"/>
-          <w:cs/>
-        </w:rPr>
-        <w:t>थावह</w:t>
-      </w:r>
-      <w:proofErr w:type="spellEnd"/>
-      <w:r>
-        <w:rPr>
-          <w:rFonts w:cs="Mangal"/>
-          <w:b/>
-          <w:bCs/>
-          <w:szCs w:val="24"/>
-          <w:cs/>
-        </w:rPr>
-        <w:t xml:space="preserve"> </w:t>
-      </w:r>
-      <w:r>
-        <w:rPr>
-          <w:rFonts w:cs="Mangal" w:hint="cs"/>
-          <w:b/>
-          <w:bCs/>
-          <w:szCs w:val="24"/>
-          <w:cs/>
-        </w:rPr>
-        <w:t>सच</w:t>
-      </w:r>
-      <w:r>
-        <w:rPr>
-          <w:rFonts w:cs="Mangal"/>
-          <w:b/>
-          <w:bCs/>
-          <w:szCs w:val="24"/>
-          <w:cs/>
-        </w:rPr>
-        <w:t xml:space="preserve"> </w:t>
-      </w:r>
-      <w:proofErr w:type="spellStart"/>
-      <w:r>
-        <w:rPr>
-          <w:rFonts w:cs="Mangal" w:hint="cs"/>
-          <w:b/>
-          <w:bCs/>
-          <w:szCs w:val="24"/>
-          <w:cs/>
-        </w:rPr>
-        <w:t>थाजो</w:t>
-      </w:r>
-      <w:proofErr w:type="spellEnd"/>
-      <w:r>
-        <w:rPr>
-          <w:rFonts w:cs="Mangal"/>
-          <w:b/>
-          <w:bCs/>
-          <w:szCs w:val="24"/>
-          <w:cs/>
-        </w:rPr>
-        <w:t xml:space="preserve"> </w:t>
-      </w:r>
-      <w:r>
-        <w:rPr>
-          <w:rFonts w:cs="Mangal" w:hint="cs"/>
-          <w:b/>
-          <w:bCs/>
-          <w:szCs w:val="24"/>
-          <w:cs/>
-        </w:rPr>
-        <w:t>सच</w:t>
-      </w:r>
-      <w:r>
-        <w:rPr>
-          <w:rFonts w:cs="Mangal"/>
-          <w:b/>
-          <w:bCs/>
-          <w:szCs w:val="24"/>
-          <w:cs/>
-        </w:rPr>
-        <w:t xml:space="preserve"> </w:t>
-      </w:r>
-      <w:proofErr w:type="spellStart"/>
-      <w:r>
-        <w:rPr>
-          <w:rFonts w:cs="Mangal" w:hint="cs"/>
-          <w:b/>
-          <w:bCs/>
-          <w:szCs w:val="24"/>
-          <w:cs/>
-        </w:rPr>
-        <w:t>होगावह</w:t>
-      </w:r>
-      <w:proofErr w:type="spellEnd"/>
-      <w:r>
-        <w:rPr>
-          <w:rFonts w:cs="Mangal"/>
-          <w:b/>
-          <w:bCs/>
-          <w:szCs w:val="24"/>
-          <w:cs/>
-        </w:rPr>
-        <w:t xml:space="preserve"> </w:t>
-      </w:r>
-      <w:r>
-        <w:rPr>
-          <w:rFonts w:cs="Mangal" w:hint="cs"/>
-          <w:b/>
-          <w:bCs/>
-          <w:szCs w:val="24"/>
-          <w:cs/>
-        </w:rPr>
-        <w:t>सच</w:t>
-      </w:r>
-      <w:r>
-        <w:rPr>
-          <w:rFonts w:cs="Mangal"/>
-          <w:b/>
-          <w:bCs/>
-          <w:szCs w:val="24"/>
-          <w:cs/>
-        </w:rPr>
-        <w:t xml:space="preserve"> </w:t>
-      </w:r>
-      <w:r>
-        <w:rPr>
-          <w:rFonts w:cs="Mangal" w:hint="cs"/>
-          <w:b/>
-          <w:bCs/>
-          <w:szCs w:val="24"/>
-          <w:cs/>
-        </w:rPr>
-        <w:t>ही</w:t>
-      </w:r>
-      <w:r>
-        <w:rPr>
-          <w:rFonts w:cs="Mangal"/>
-          <w:b/>
-          <w:bCs/>
-          <w:szCs w:val="24"/>
-          <w:cs/>
-        </w:rPr>
-        <w:t xml:space="preserve"> </w:t>
-      </w:r>
-      <w:proofErr w:type="spellStart"/>
-      <w:r>
-        <w:rPr>
-          <w:rFonts w:cs="Mangal" w:hint="cs"/>
-          <w:b/>
-          <w:bCs/>
-          <w:szCs w:val="24"/>
-          <w:cs/>
-        </w:rPr>
-        <w:t>रहेगाउसे</w:t>
-      </w:r>
-      <w:proofErr w:type="spellEnd"/>
-      <w:r>
-        <w:rPr>
-          <w:rFonts w:cs="Mangal"/>
-          <w:b/>
-          <w:bCs/>
-          <w:szCs w:val="24"/>
-          <w:cs/>
-        </w:rPr>
-        <w:t xml:space="preserve"> </w:t>
-      </w:r>
-      <w:r>
-        <w:rPr>
-          <w:rFonts w:cs="Mangal" w:hint="cs"/>
-          <w:b/>
-          <w:bCs/>
-          <w:szCs w:val="24"/>
-          <w:cs/>
-        </w:rPr>
-        <w:t>ना</w:t>
-      </w:r>
-      <w:r>
-        <w:rPr>
-          <w:rFonts w:cs="Mangal"/>
-          <w:b/>
-          <w:bCs/>
-          <w:szCs w:val="24"/>
-          <w:cs/>
-        </w:rPr>
-        <w:t xml:space="preserve"> </w:t>
-      </w:r>
-      <w:r>
-        <w:rPr>
-          <w:rFonts w:cs="Mangal" w:hint="cs"/>
-          <w:b/>
-          <w:bCs/>
-          <w:szCs w:val="24"/>
-          <w:cs/>
-        </w:rPr>
-        <w:t>तुम</w:t>
-      </w:r>
-      <w:r>
-        <w:rPr>
-          <w:rFonts w:cs="Mangal"/>
-          <w:b/>
-          <w:bCs/>
-          <w:szCs w:val="24"/>
-          <w:cs/>
-        </w:rPr>
-        <w:t xml:space="preserve"> </w:t>
-      </w:r>
-      <w:r>
-        <w:rPr>
-          <w:rFonts w:cs="Mangal" w:hint="cs"/>
-          <w:b/>
-          <w:bCs/>
-          <w:szCs w:val="24"/>
-          <w:cs/>
-        </w:rPr>
-        <w:t>बदल</w:t>
-      </w:r>
-      <w:r>
-        <w:rPr>
-          <w:rFonts w:cs="Mangal"/>
-          <w:b/>
-          <w:bCs/>
-          <w:szCs w:val="24"/>
-          <w:cs/>
-        </w:rPr>
-        <w:t xml:space="preserve"> </w:t>
-      </w:r>
-      <w:r>
-        <w:rPr>
-          <w:rFonts w:cs="Mangal" w:hint="cs"/>
-          <w:b/>
-          <w:bCs/>
-          <w:szCs w:val="24"/>
-          <w:cs/>
-        </w:rPr>
-        <w:t>सकते</w:t>
-      </w:r>
-      <w:r>
-        <w:rPr>
-          <w:rFonts w:cs="Mangal"/>
-          <w:b/>
-          <w:bCs/>
-          <w:szCs w:val="24"/>
-          <w:cs/>
-        </w:rPr>
-        <w:t xml:space="preserve"> </w:t>
-      </w:r>
-      <w:r>
-        <w:rPr>
-          <w:rFonts w:cs="Mangal" w:hint="cs"/>
-          <w:b/>
-          <w:bCs/>
-          <w:szCs w:val="24"/>
-          <w:cs/>
-        </w:rPr>
-        <w:t>हो</w:t>
-      </w:r>
-      <w:r>
-        <w:rPr>
-          <w:rFonts w:cs="Mangal"/>
-          <w:b/>
-          <w:bCs/>
-          <w:szCs w:val="24"/>
-          <w:cs/>
-        </w:rPr>
-        <w:t xml:space="preserve"> </w:t>
-      </w:r>
-      <w:r>
-        <w:rPr>
-          <w:rFonts w:cs="Mangal" w:hint="cs"/>
-          <w:b/>
-          <w:bCs/>
-          <w:szCs w:val="24"/>
-          <w:cs/>
-        </w:rPr>
-        <w:t>ना</w:t>
-      </w:r>
-      <w:r>
-        <w:rPr>
-          <w:rFonts w:cs="Mangal"/>
-          <w:b/>
-          <w:bCs/>
-          <w:szCs w:val="24"/>
-          <w:cs/>
-        </w:rPr>
-        <w:t xml:space="preserve"> </w:t>
-      </w:r>
-      <w:proofErr w:type="spellStart"/>
-      <w:r>
-        <w:rPr>
-          <w:rFonts w:cs="Mangal" w:hint="cs"/>
-          <w:b/>
-          <w:bCs/>
-          <w:szCs w:val="24"/>
-          <w:cs/>
-        </w:rPr>
-        <w:t>मैंना</w:t>
-      </w:r>
-      <w:proofErr w:type="spellEnd"/>
-      <w:r>
-        <w:rPr>
-          <w:rFonts w:cs="Mangal"/>
-          <w:b/>
-          <w:bCs/>
-          <w:szCs w:val="24"/>
-          <w:cs/>
-        </w:rPr>
-        <w:t xml:space="preserve"> </w:t>
-      </w:r>
-      <w:proofErr w:type="spellStart"/>
-      <w:r>
-        <w:rPr>
-          <w:rFonts w:cs="Mangal" w:hint="cs"/>
-          <w:b/>
-          <w:bCs/>
-          <w:szCs w:val="24"/>
-          <w:cs/>
-        </w:rPr>
-        <w:t>कानूनका</w:t>
-      </w:r>
-      <w:proofErr w:type="spellEnd"/>
-      <w:r>
-        <w:rPr>
-          <w:rFonts w:cs="Mangal"/>
-          <w:b/>
-          <w:bCs/>
-          <w:szCs w:val="24"/>
-          <w:cs/>
-        </w:rPr>
-        <w:t xml:space="preserve"> </w:t>
-      </w:r>
-      <w:r>
-        <w:rPr>
-          <w:rFonts w:cs="Mangal" w:hint="cs"/>
-          <w:b/>
-          <w:bCs/>
-          <w:szCs w:val="24"/>
-          <w:cs/>
-        </w:rPr>
-        <w:t>दर्द</w:t>
-      </w:r>
-      <w:r>
-        <w:rPr>
-          <w:rFonts w:cs="Mangal"/>
-          <w:b/>
-          <w:bCs/>
-          <w:szCs w:val="24"/>
-          <w:cs/>
-        </w:rPr>
-        <w:t xml:space="preserve"> </w:t>
-      </w:r>
-      <w:r>
-        <w:rPr>
-          <w:rFonts w:cs="Mangal" w:hint="cs"/>
-          <w:b/>
-          <w:bCs/>
-          <w:szCs w:val="24"/>
-          <w:cs/>
-        </w:rPr>
-        <w:t>दिखाकर</w:t>
-      </w:r>
-      <w:r>
-        <w:rPr>
-          <w:rFonts w:cs="Mangal"/>
-          <w:b/>
-          <w:bCs/>
-          <w:szCs w:val="24"/>
-          <w:cs/>
-        </w:rPr>
-        <w:t xml:space="preserve"> </w:t>
-      </w:r>
-      <w:r>
-        <w:rPr>
-          <w:rFonts w:cs="Mangal" w:hint="cs"/>
-          <w:b/>
-          <w:bCs/>
-          <w:szCs w:val="24"/>
-          <w:cs/>
-        </w:rPr>
-        <w:t>झूठ</w:t>
-      </w:r>
-      <w:r>
-        <w:rPr>
-          <w:rFonts w:cs="Mangal"/>
-          <w:b/>
-          <w:bCs/>
-          <w:szCs w:val="24"/>
-          <w:cs/>
-        </w:rPr>
-        <w:t xml:space="preserve"> </w:t>
-      </w:r>
-      <w:r>
-        <w:rPr>
-          <w:rFonts w:cs="Mangal" w:hint="cs"/>
-          <w:b/>
-          <w:bCs/>
-          <w:szCs w:val="24"/>
-          <w:cs/>
-        </w:rPr>
-        <w:t>को</w:t>
-      </w:r>
-      <w:r>
-        <w:rPr>
-          <w:rFonts w:cs="Mangal"/>
-          <w:b/>
-          <w:bCs/>
-          <w:szCs w:val="24"/>
-          <w:cs/>
-        </w:rPr>
-        <w:t xml:space="preserve"> </w:t>
-      </w:r>
-      <w:r>
-        <w:rPr>
-          <w:rFonts w:cs="Mangal" w:hint="cs"/>
-          <w:b/>
-          <w:bCs/>
-          <w:szCs w:val="24"/>
-          <w:cs/>
-        </w:rPr>
-        <w:t>सच</w:t>
-      </w:r>
-      <w:r>
-        <w:rPr>
-          <w:rFonts w:cs="Mangal"/>
-          <w:b/>
-          <w:bCs/>
-          <w:szCs w:val="24"/>
-          <w:cs/>
-        </w:rPr>
-        <w:t xml:space="preserve"> </w:t>
-      </w:r>
-      <w:r>
-        <w:rPr>
-          <w:rFonts w:cs="Mangal" w:hint="cs"/>
-          <w:b/>
-          <w:bCs/>
-          <w:szCs w:val="24"/>
-          <w:cs/>
-        </w:rPr>
-        <w:t>तो</w:t>
-      </w:r>
-      <w:r>
-        <w:rPr>
-          <w:rFonts w:cs="Mangal"/>
-          <w:b/>
-          <w:bCs/>
-          <w:szCs w:val="24"/>
-          <w:cs/>
-        </w:rPr>
-        <w:t xml:space="preserve"> </w:t>
-      </w:r>
-      <w:r>
-        <w:rPr>
-          <w:rFonts w:cs="Mangal" w:hint="cs"/>
-          <w:b/>
-          <w:bCs/>
-          <w:szCs w:val="24"/>
-          <w:cs/>
-        </w:rPr>
-        <w:t>बनाया</w:t>
-      </w:r>
-      <w:r>
-        <w:rPr>
-          <w:rFonts w:cs="Mangal"/>
-          <w:b/>
-          <w:bCs/>
-          <w:szCs w:val="24"/>
-          <w:cs/>
-        </w:rPr>
-        <w:t xml:space="preserve"> </w:t>
-      </w:r>
-      <w:r>
-        <w:rPr>
-          <w:rFonts w:cs="Mangal" w:hint="cs"/>
-          <w:b/>
-          <w:bCs/>
-          <w:szCs w:val="24"/>
-          <w:cs/>
-        </w:rPr>
-        <w:t>जा</w:t>
-      </w:r>
-      <w:r>
-        <w:rPr>
-          <w:rFonts w:cs="Mangal"/>
-          <w:b/>
-          <w:bCs/>
-          <w:szCs w:val="24"/>
-          <w:cs/>
-        </w:rPr>
-        <w:t xml:space="preserve"> </w:t>
-      </w:r>
-      <w:r>
-        <w:rPr>
-          <w:rFonts w:cs="Mangal" w:hint="cs"/>
-          <w:b/>
-          <w:bCs/>
-          <w:szCs w:val="24"/>
-          <w:cs/>
-        </w:rPr>
-        <w:t>सकता</w:t>
-      </w:r>
-      <w:r>
-        <w:rPr>
-          <w:rFonts w:cs="Mangal"/>
-          <w:b/>
-          <w:bCs/>
-          <w:szCs w:val="24"/>
-          <w:cs/>
-        </w:rPr>
-        <w:t xml:space="preserve"> </w:t>
-      </w:r>
-      <w:r>
-        <w:rPr>
-          <w:rFonts w:cs="Mangal" w:hint="cs"/>
-          <w:b/>
-          <w:bCs/>
-          <w:szCs w:val="24"/>
-          <w:cs/>
-        </w:rPr>
-        <w:t>है</w:t>
-      </w:r>
-      <w:r>
-        <w:rPr>
-          <w:rFonts w:cs="Mangal"/>
-          <w:b/>
-          <w:bCs/>
-          <w:szCs w:val="24"/>
-          <w:cs/>
-        </w:rPr>
-        <w:t xml:space="preserve"> </w:t>
-      </w:r>
-      <w:r>
-        <w:rPr>
-          <w:rFonts w:cs="Mangal" w:hint="cs"/>
-          <w:b/>
-          <w:bCs/>
-          <w:szCs w:val="24"/>
-          <w:cs/>
-        </w:rPr>
-        <w:t>पर</w:t>
-      </w:r>
-      <w:r>
-        <w:rPr>
-          <w:rFonts w:cs="Mangal"/>
-          <w:b/>
-          <w:bCs/>
-          <w:szCs w:val="24"/>
-          <w:cs/>
-        </w:rPr>
-        <w:t xml:space="preserve"> </w:t>
-      </w:r>
-      <w:r>
-        <w:rPr>
-          <w:rFonts w:cs="Mangal" w:hint="cs"/>
-          <w:b/>
-          <w:bCs/>
-          <w:szCs w:val="24"/>
-          <w:cs/>
-        </w:rPr>
-        <w:t>सच</w:t>
-      </w:r>
-      <w:r>
-        <w:rPr>
-          <w:rFonts w:cs="Mangal"/>
-          <w:b/>
-          <w:bCs/>
-          <w:szCs w:val="24"/>
-          <w:cs/>
-        </w:rPr>
-        <w:t xml:space="preserve"> </w:t>
-      </w:r>
-      <w:r>
-        <w:rPr>
-          <w:rFonts w:cs="Mangal" w:hint="cs"/>
-          <w:b/>
-          <w:bCs/>
-          <w:szCs w:val="24"/>
-          <w:cs/>
-        </w:rPr>
-        <w:t>को</w:t>
-      </w:r>
-      <w:r>
-        <w:rPr>
-          <w:rFonts w:cs="Mangal"/>
-          <w:b/>
-          <w:bCs/>
-          <w:szCs w:val="24"/>
-          <w:cs/>
-        </w:rPr>
-        <w:t xml:space="preserve"> </w:t>
-      </w:r>
-      <w:r>
-        <w:rPr>
-          <w:rFonts w:cs="Mangal" w:hint="cs"/>
-          <w:b/>
-          <w:bCs/>
-          <w:szCs w:val="24"/>
-          <w:cs/>
-        </w:rPr>
-        <w:t>झूठ</w:t>
-      </w:r>
-      <w:r>
-        <w:rPr>
-          <w:rFonts w:cs="Mangal"/>
-          <w:b/>
-          <w:bCs/>
-          <w:szCs w:val="24"/>
-          <w:cs/>
-        </w:rPr>
-        <w:t xml:space="preserve"> </w:t>
-      </w:r>
-      <w:r>
-        <w:rPr>
-          <w:rFonts w:cs="Mangal" w:hint="cs"/>
-          <w:b/>
-          <w:bCs/>
-          <w:szCs w:val="24"/>
-          <w:cs/>
-        </w:rPr>
-        <w:t>नहीं</w:t>
-      </w:r>
-      <w:r>
-        <w:rPr>
-          <w:rFonts w:cs="Mangal"/>
-          <w:b/>
-          <w:bCs/>
-          <w:szCs w:val="24"/>
-          <w:cs/>
-        </w:rPr>
-        <w:t xml:space="preserve"> </w:t>
-      </w:r>
-      <w:r>
-        <w:rPr>
-          <w:rFonts w:cs="Mangal" w:hint="cs"/>
-          <w:b/>
-          <w:bCs/>
-          <w:szCs w:val="24"/>
-          <w:cs/>
-        </w:rPr>
-        <w:t>बनाया</w:t>
-      </w:r>
-      <w:r>
-        <w:rPr>
-          <w:rFonts w:cs="Mangal"/>
-          <w:b/>
-          <w:bCs/>
-          <w:szCs w:val="24"/>
-          <w:cs/>
-        </w:rPr>
-        <w:t xml:space="preserve"> </w:t>
-      </w:r>
-      <w:r>
-        <w:rPr>
-          <w:rFonts w:cs="Mangal" w:hint="cs"/>
-          <w:b/>
-          <w:bCs/>
-          <w:szCs w:val="24"/>
-          <w:cs/>
-        </w:rPr>
-        <w:t>जा</w:t>
-      </w:r>
-      <w:r>
-        <w:rPr>
-          <w:rFonts w:cs="Mangal"/>
-          <w:b/>
-          <w:bCs/>
-          <w:szCs w:val="24"/>
-          <w:cs/>
-        </w:rPr>
-        <w:t xml:space="preserve">  </w:t>
-      </w:r>
-      <w:r>
-        <w:rPr>
-          <w:rFonts w:cs="Mangal" w:hint="cs"/>
-          <w:b/>
-          <w:bCs/>
-          <w:szCs w:val="24"/>
-          <w:cs/>
-        </w:rPr>
-        <w:t>सकता</w:t>
-      </w:r>
-      <w:r>
-        <w:rPr>
-          <w:rFonts w:cs="Mangal"/>
-          <w:b/>
-          <w:bCs/>
-          <w:szCs w:val="24"/>
-          <w:cs/>
-        </w:rPr>
-        <w:t xml:space="preserve"> </w:t>
-      </w:r>
-      <w:r>
-        <w:rPr>
-          <w:rFonts w:cs="Mangal" w:hint="cs"/>
-          <w:b/>
-          <w:bCs/>
-          <w:szCs w:val="24"/>
-          <w:cs/>
-        </w:rPr>
-        <w:t>है</w:t>
+        <w:t xml:space="preserve">मिलावटी खाओ </w:t>
       </w:r>
     </w:p>
     <w:p>
@@ -1044,18 +237,88 @@
           <w:szCs w:val="24"/>
           <w:cs/>
         </w:rPr>
-        <w:t xml:space="preserve">और सच यही है </w:t>
+        <w:t>१.</w:t>
+      </w:r>
+      <w:r>
+        <w:rPr>
+          <w:rFonts w:ascii="Arial" w:hAnsi="Arial" w:cs="Arial" w:hint="cs"/>
+          <w:b/>
+          <w:bCs/>
+          <w:szCs w:val="24"/>
+          <w:cs/>
+        </w:rPr>
+        <w:t>”</w:t>
+      </w:r>
+      <w:r>
+        <w:rPr>
+          <w:rFonts w:cs="Mangal" w:hint="cs"/>
+          <w:b/>
+          <w:bCs/>
+          <w:szCs w:val="24"/>
+          <w:cs/>
+        </w:rPr>
+        <w:t>बबुआ</w:t>
+      </w:r>
+      <w:r>
+        <w:rPr>
+          <w:rFonts w:cs="Mangal"/>
+          <w:b/>
+          <w:bCs/>
+          <w:szCs w:val="24"/>
+          <w:cs/>
+        </w:rPr>
+        <w:t xml:space="preserve"> !</w:t>
+      </w:r>
+      <w:r>
+        <w:rPr>
+          <w:rFonts w:cs="Mangal" w:hint="cs"/>
+          <w:b/>
+          <w:bCs/>
+          <w:szCs w:val="24"/>
+          <w:cs/>
+        </w:rPr>
+        <w:t>जो</w:t>
+      </w:r>
+      <w:r>
+        <w:rPr>
+          <w:rFonts w:cs="Mangal"/>
+          <w:b/>
+          <w:bCs/>
+          <w:szCs w:val="24"/>
+          <w:cs/>
+        </w:rPr>
+        <w:t xml:space="preserve"> </w:t>
+      </w:r>
+      <w:r>
+        <w:rPr>
+          <w:rFonts w:cs="Mangal" w:hint="cs"/>
+          <w:b/>
+          <w:bCs/>
+          <w:szCs w:val="24"/>
+          <w:cs/>
+        </w:rPr>
+        <w:t>सच</w:t>
+      </w:r>
+      <w:r>
+        <w:rPr>
+          <w:rFonts w:cs="Mangal"/>
+          <w:b/>
+          <w:bCs/>
+          <w:szCs w:val="24"/>
+          <w:cs/>
+        </w:rPr>
+        <w:t xml:space="preserve"> </w:t>
       </w:r>
       <w:proofErr w:type="spellStart"/>
       <w:r>
         <w:rPr>
-          <w:rFonts w:cs="Mangal"/>
-          <w:b/>
-          <w:bCs/>
-          <w:szCs w:val="24"/>
-          <w:cs/>
-        </w:rPr>
-        <w:t>किमिलावट</w:t>
+          <w:rFonts w:cs="Mangal" w:hint="cs"/>
+          <w:b/>
+          <w:bCs/>
+          <w:szCs w:val="24"/>
+          <w:cs/>
+        </w:rPr>
+        <w:t>हैजो</w:t>
       </w:r>
       <w:proofErr w:type="spellEnd"/>
       <w:r>
@@ -1066,18 +329,38 @@
           <w:szCs w:val="24"/>
           <w:cs/>
         </w:rPr>
-        <w:t xml:space="preserve"> के बिना जिंदगी </w:t>
+        <w:t xml:space="preserve"> </w:t>
+      </w:r>
+      <w:r>
+        <w:rPr>
+          <w:rFonts w:cs="Mangal" w:hint="cs"/>
+          <w:b/>
+          <w:bCs/>
+          <w:szCs w:val="24"/>
+          <w:cs/>
+        </w:rPr>
+        <w:t>सच</w:t>
+      </w:r>
+      <w:r>
+        <w:rPr>
+          <w:rFonts w:cs="Mangal"/>
+          <w:b/>
+          <w:bCs/>
+          <w:szCs w:val="24"/>
+          <w:cs/>
+        </w:rPr>
+        <w:t xml:space="preserve"> </w:t>
       </w:r>
       <w:proofErr w:type="spellStart"/>
       <w:r>
         <w:rPr>
-          <w:rFonts w:cs="Mangal"/>
-          <w:b/>
-          <w:bCs/>
-          <w:szCs w:val="24"/>
-          <w:cs/>
-        </w:rPr>
-        <w:t>जिंदगी</w:t>
+          <w:rFonts w:cs="Mangal" w:hint="cs"/>
+          <w:b/>
+          <w:bCs/>
+          <w:szCs w:val="24"/>
+          <w:cs/>
+        </w:rPr>
+        <w:t>थावह</w:t>
       </w:r>
       <w:proofErr w:type="spellEnd"/>
       <w:r>
@@ -1088,18 +371,38 @@
           <w:szCs w:val="24"/>
           <w:cs/>
         </w:rPr>
-        <w:t xml:space="preserve"> नहीं मिलावट के बिना इम्यूनिटी </w:t>
+        <w:t xml:space="preserve"> </w:t>
+      </w:r>
+      <w:r>
+        <w:rPr>
+          <w:rFonts w:cs="Mangal" w:hint="cs"/>
+          <w:b/>
+          <w:bCs/>
+          <w:szCs w:val="24"/>
+          <w:cs/>
+        </w:rPr>
+        <w:t>सच</w:t>
+      </w:r>
+      <w:r>
+        <w:rPr>
+          <w:rFonts w:cs="Mangal"/>
+          <w:b/>
+          <w:bCs/>
+          <w:szCs w:val="24"/>
+          <w:cs/>
+        </w:rPr>
+        <w:t xml:space="preserve"> </w:t>
       </w:r>
       <w:proofErr w:type="spellStart"/>
       <w:r>
         <w:rPr>
-          <w:rFonts w:cs="Mangal"/>
-          <w:b/>
-          <w:bCs/>
-          <w:szCs w:val="24"/>
-          <w:cs/>
-        </w:rPr>
-        <w:t>इम्यूनिटी</w:t>
+          <w:rFonts w:cs="Mangal" w:hint="cs"/>
+          <w:b/>
+          <w:bCs/>
+          <w:szCs w:val="24"/>
+          <w:cs/>
+        </w:rPr>
+        <w:t>थाजो</w:t>
       </w:r>
       <w:proofErr w:type="spellEnd"/>
       <w:r>
@@ -1112,16 +415,36 @@
         </w:rPr>
         <w:t xml:space="preserve"> </w:t>
       </w:r>
+      <w:r>
+        <w:rPr>
+          <w:rFonts w:cs="Mangal" w:hint="cs"/>
+          <w:b/>
+          <w:bCs/>
+          <w:szCs w:val="24"/>
+          <w:cs/>
+        </w:rPr>
+        <w:t>सच</w:t>
+      </w:r>
+      <w:r>
+        <w:rPr>
+          <w:rFonts w:cs="Mangal"/>
+          <w:b/>
+          <w:bCs/>
+          <w:szCs w:val="24"/>
+          <w:cs/>
+        </w:rPr>
+        <w:t xml:space="preserve"> </w:t>
+      </w:r>
       <w:proofErr w:type="spellStart"/>
       <w:r>
         <w:rPr>
-          <w:rFonts w:cs="Mangal"/>
-          <w:b/>
-          <w:bCs/>
-          <w:szCs w:val="24"/>
-          <w:cs/>
-        </w:rPr>
-        <w:t>नहींबॉडी</w:t>
+          <w:rFonts w:cs="Mangal" w:hint="cs"/>
+          <w:b/>
+          <w:bCs/>
+          <w:szCs w:val="24"/>
+          <w:cs/>
+        </w:rPr>
+        <w:t>होगावह</w:t>
       </w:r>
       <w:proofErr w:type="spellEnd"/>
       <w:r>
@@ -1132,18 +455,58 @@
           <w:szCs w:val="24"/>
           <w:cs/>
         </w:rPr>
-        <w:t xml:space="preserve"> के बिना बॉडी </w:t>
+        <w:t xml:space="preserve"> </w:t>
+      </w:r>
+      <w:r>
+        <w:rPr>
+          <w:rFonts w:cs="Mangal" w:hint="cs"/>
+          <w:b/>
+          <w:bCs/>
+          <w:szCs w:val="24"/>
+          <w:cs/>
+        </w:rPr>
+        <w:t>सच</w:t>
+      </w:r>
+      <w:r>
+        <w:rPr>
+          <w:rFonts w:cs="Mangal"/>
+          <w:b/>
+          <w:bCs/>
+          <w:szCs w:val="24"/>
+          <w:cs/>
+        </w:rPr>
+        <w:t xml:space="preserve"> </w:t>
+      </w:r>
+      <w:r>
+        <w:rPr>
+          <w:rFonts w:cs="Mangal" w:hint="cs"/>
+          <w:b/>
+          <w:bCs/>
+          <w:szCs w:val="24"/>
+          <w:cs/>
+        </w:rPr>
+        <w:t>ही</w:t>
+      </w:r>
+      <w:r>
+        <w:rPr>
+          <w:rFonts w:cs="Mangal"/>
+          <w:b/>
+          <w:bCs/>
+          <w:szCs w:val="24"/>
+          <w:cs/>
+        </w:rPr>
+        <w:t xml:space="preserve"> </w:t>
       </w:r>
       <w:proofErr w:type="spellStart"/>
       <w:r>
         <w:rPr>
-          <w:rFonts w:cs="Mangal"/>
-          <w:b/>
-          <w:bCs/>
-          <w:szCs w:val="24"/>
-          <w:cs/>
-        </w:rPr>
-        <w:t>बॉडी</w:t>
+          <w:rFonts w:cs="Mangal" w:hint="cs"/>
+          <w:b/>
+          <w:bCs/>
+          <w:szCs w:val="24"/>
+          <w:cs/>
+        </w:rPr>
+        <w:t>रहेगाउसे</w:t>
       </w:r>
       <w:proofErr w:type="spellEnd"/>
       <w:r>
@@ -1156,16 +519,136 @@
         </w:rPr>
         <w:t xml:space="preserve"> </w:t>
       </w:r>
+      <w:r>
+        <w:rPr>
+          <w:rFonts w:cs="Mangal" w:hint="cs"/>
+          <w:b/>
+          <w:bCs/>
+          <w:szCs w:val="24"/>
+          <w:cs/>
+        </w:rPr>
+        <w:t>ना</w:t>
+      </w:r>
+      <w:r>
+        <w:rPr>
+          <w:rFonts w:cs="Mangal"/>
+          <w:b/>
+          <w:bCs/>
+          <w:szCs w:val="24"/>
+          <w:cs/>
+        </w:rPr>
+        <w:t xml:space="preserve"> </w:t>
+      </w:r>
+      <w:r>
+        <w:rPr>
+          <w:rFonts w:cs="Mangal" w:hint="cs"/>
+          <w:b/>
+          <w:bCs/>
+          <w:szCs w:val="24"/>
+          <w:cs/>
+        </w:rPr>
+        <w:t>तुम</w:t>
+      </w:r>
+      <w:r>
+        <w:rPr>
+          <w:rFonts w:cs="Mangal"/>
+          <w:b/>
+          <w:bCs/>
+          <w:szCs w:val="24"/>
+          <w:cs/>
+        </w:rPr>
+        <w:t xml:space="preserve"> </w:t>
+      </w:r>
+      <w:r>
+        <w:rPr>
+          <w:rFonts w:cs="Mangal" w:hint="cs"/>
+          <w:b/>
+          <w:bCs/>
+          <w:szCs w:val="24"/>
+          <w:cs/>
+        </w:rPr>
+        <w:t>बदल</w:t>
+      </w:r>
+      <w:r>
+        <w:rPr>
+          <w:rFonts w:cs="Mangal"/>
+          <w:b/>
+          <w:bCs/>
+          <w:szCs w:val="24"/>
+          <w:cs/>
+        </w:rPr>
+        <w:t xml:space="preserve"> </w:t>
+      </w:r>
+      <w:r>
+        <w:rPr>
+          <w:rFonts w:cs="Mangal" w:hint="cs"/>
+          <w:b/>
+          <w:bCs/>
+          <w:szCs w:val="24"/>
+          <w:cs/>
+        </w:rPr>
+        <w:t>सकते</w:t>
+      </w:r>
+      <w:r>
+        <w:rPr>
+          <w:rFonts w:cs="Mangal"/>
+          <w:b/>
+          <w:bCs/>
+          <w:szCs w:val="24"/>
+          <w:cs/>
+        </w:rPr>
+        <w:t xml:space="preserve"> </w:t>
+      </w:r>
+      <w:r>
+        <w:rPr>
+          <w:rFonts w:cs="Mangal" w:hint="cs"/>
+          <w:b/>
+          <w:bCs/>
+          <w:szCs w:val="24"/>
+          <w:cs/>
+        </w:rPr>
+        <w:t>हो</w:t>
+      </w:r>
+      <w:r>
+        <w:rPr>
+          <w:rFonts w:cs="Mangal"/>
+          <w:b/>
+          <w:bCs/>
+          <w:szCs w:val="24"/>
+          <w:cs/>
+        </w:rPr>
+        <w:t xml:space="preserve"> </w:t>
+      </w:r>
+      <w:r>
+        <w:rPr>
+          <w:rFonts w:cs="Mangal" w:hint="cs"/>
+          <w:b/>
+          <w:bCs/>
+          <w:szCs w:val="24"/>
+          <w:cs/>
+        </w:rPr>
+        <w:t>ना</w:t>
+      </w:r>
+      <w:r>
+        <w:rPr>
+          <w:rFonts w:cs="Mangal"/>
+          <w:b/>
+          <w:bCs/>
+          <w:szCs w:val="24"/>
+          <w:cs/>
+        </w:rPr>
+        <w:t xml:space="preserve"> </w:t>
+      </w:r>
       <w:proofErr w:type="spellStart"/>
       <w:r>
         <w:rPr>
-          <w:rFonts w:cs="Mangal"/>
-          <w:b/>
-          <w:bCs/>
-          <w:szCs w:val="24"/>
-          <w:cs/>
-        </w:rPr>
-        <w:t>नहींचाहे</w:t>
+          <w:rFonts w:cs="Mangal" w:hint="cs"/>
+          <w:b/>
+          <w:bCs/>
+          <w:szCs w:val="24"/>
+          <w:cs/>
+        </w:rPr>
+        <w:t>मैंना</w:t>
       </w:r>
       <w:proofErr w:type="spellEnd"/>
       <w:r>
@@ -1176,18 +659,18 @@
           <w:szCs w:val="24"/>
           <w:cs/>
         </w:rPr>
-        <w:t xml:space="preserve"> वह फिर गधे की हो या आदमी </w:t>
+        <w:t xml:space="preserve"> </w:t>
       </w:r>
       <w:proofErr w:type="spellStart"/>
       <w:r>
         <w:rPr>
-          <w:rFonts w:cs="Mangal"/>
-          <w:b/>
-          <w:bCs/>
-          <w:szCs w:val="24"/>
-          <w:cs/>
-        </w:rPr>
-        <w:t>कीचींटी</w:t>
+          <w:rFonts w:cs="Mangal" w:hint="cs"/>
+          <w:b/>
+          <w:bCs/>
+          <w:szCs w:val="24"/>
+          <w:cs/>
+        </w:rPr>
+        <w:t>कानूनका</w:t>
       </w:r>
       <w:proofErr w:type="spellEnd"/>
       <w:r>
@@ -1198,109 +681,377 @@
           <w:szCs w:val="24"/>
           <w:cs/>
         </w:rPr>
-        <w:t xml:space="preserve"> की हो या फिर हाथी </w:t>
-      </w:r>
-      <w:proofErr w:type="spellStart"/>
-      <w:r>
-        <w:rPr>
-          <w:rFonts w:cs="Mangal"/>
-          <w:b/>
-          <w:bCs/>
-          <w:szCs w:val="24"/>
-          <w:cs/>
-        </w:rPr>
-        <w:t>कीएंटीबॉडीज</w:t>
-      </w:r>
-      <w:proofErr w:type="spellEnd"/>
-      <w:r>
-        <w:rPr>
-          <w:rFonts w:cs="Mangal"/>
-          <w:b/>
-          <w:bCs/>
-          <w:szCs w:val="24"/>
-          <w:cs/>
-        </w:rPr>
-        <w:t xml:space="preserve"> है तो बॉडी है</w:t>
-      </w:r>
-      <w:r>
-        <w:rPr>
-          <w:rFonts w:ascii="Arial" w:hAnsi="Arial" w:cs="Arial" w:hint="cs"/>
-          <w:b/>
-          <w:bCs/>
-          <w:szCs w:val="24"/>
-          <w:cs/>
-        </w:rPr>
-        <w:t>”</w:t>
-      </w:r>
-      <w:r>
-        <w:rPr>
-          <w:rFonts w:cs="Mangal"/>
-          <w:b/>
-          <w:bCs/>
-          <w:szCs w:val="24"/>
-          <w:cs/>
-        </w:rPr>
-        <w:t>(</w:t>
-      </w:r>
-      <w:r>
-        <w:rPr>
-          <w:rFonts w:cs="Mangal" w:hint="cs"/>
-          <w:b/>
-          <w:bCs/>
-          <w:szCs w:val="24"/>
-          <w:cs/>
-        </w:rPr>
-        <w:t>पृ</w:t>
-      </w:r>
-      <w:r>
-        <w:rPr>
-          <w:rFonts w:cs="Mangal"/>
-          <w:b/>
-          <w:bCs/>
-          <w:szCs w:val="24"/>
-          <w:cs/>
-        </w:rPr>
-        <w:t>.</w:t>
-      </w:r>
-      <w:r>
-        <w:rPr>
-          <w:rFonts w:cs="Mangal" w:hint="cs"/>
-          <w:b/>
-          <w:bCs/>
-          <w:szCs w:val="24"/>
-          <w:cs/>
-        </w:rPr>
-        <w:t>क्र</w:t>
-      </w:r>
-      <w:r>
-        <w:rPr>
-          <w:rFonts w:cs="Mangal"/>
-          <w:b/>
-          <w:bCs/>
-          <w:szCs w:val="24"/>
-          <w:cs/>
-        </w:rPr>
-        <w:t>.</w:t>
-      </w:r>
-      <w:r>
-        <w:rPr>
-          <w:rFonts w:cs="Mangal" w:hint="cs"/>
-          <w:b/>
-          <w:bCs/>
-          <w:szCs w:val="24"/>
-          <w:cs/>
-        </w:rPr>
-        <w:t>६९</w:t>
-      </w:r>
-      <w:r>
-        <w:rPr>
-          <w:rFonts w:cs="Mangal"/>
-          <w:b/>
-          <w:bCs/>
-          <w:szCs w:val="24"/>
-          <w:cs/>
-        </w:rPr>
-        <w:t>)</w:t>
+        <w:t xml:space="preserve"> </w:t>
+      </w:r>
+      <w:r>
+        <w:rPr>
+          <w:rFonts w:cs="Mangal" w:hint="cs"/>
+          <w:b/>
+          <w:bCs/>
+          <w:szCs w:val="24"/>
+          <w:cs/>
+        </w:rPr>
+        <w:t>दर्द</w:t>
+      </w:r>
+      <w:r>
+        <w:rPr>
+          <w:rFonts w:cs="Mangal"/>
+          <w:b/>
+          <w:bCs/>
+          <w:szCs w:val="24"/>
+          <w:cs/>
+        </w:rPr>
+        <w:t xml:space="preserve"> </w:t>
+      </w:r>
+      <w:r>
+        <w:rPr>
+          <w:rFonts w:cs="Mangal" w:hint="cs"/>
+          <w:b/>
+          <w:bCs/>
+          <w:szCs w:val="24"/>
+          <w:cs/>
+        </w:rPr>
+        <w:t>दिखाकर</w:t>
+      </w:r>
+      <w:r>
+        <w:rPr>
+          <w:rFonts w:cs="Mangal"/>
+          <w:b/>
+          <w:bCs/>
+          <w:szCs w:val="24"/>
+          <w:cs/>
+        </w:rPr>
+        <w:t xml:space="preserve"> </w:t>
+      </w:r>
+      <w:r>
+        <w:rPr>
+          <w:rFonts w:cs="Mangal" w:hint="cs"/>
+          <w:b/>
+          <w:bCs/>
+          <w:szCs w:val="24"/>
+          <w:cs/>
+        </w:rPr>
+        <w:t>झूठ</w:t>
+      </w:r>
+      <w:r>
+        <w:rPr>
+          <w:rFonts w:cs="Mangal"/>
+          <w:b/>
+          <w:bCs/>
+          <w:szCs w:val="24"/>
+          <w:cs/>
+        </w:rPr>
+        <w:t xml:space="preserve"> </w:t>
+      </w:r>
+      <w:r>
+        <w:rPr>
+          <w:rFonts w:cs="Mangal" w:hint="cs"/>
+          <w:b/>
+          <w:bCs/>
+          <w:szCs w:val="24"/>
+          <w:cs/>
+        </w:rPr>
+        <w:t>को</w:t>
+      </w:r>
+      <w:r>
+        <w:rPr>
+          <w:rFonts w:cs="Mangal"/>
+          <w:b/>
+          <w:bCs/>
+          <w:szCs w:val="24"/>
+          <w:cs/>
+        </w:rPr>
+        <w:t xml:space="preserve"> </w:t>
+      </w:r>
+      <w:r>
+        <w:rPr>
+          <w:rFonts w:cs="Mangal" w:hint="cs"/>
+          <w:b/>
+          <w:bCs/>
+          <w:szCs w:val="24"/>
+          <w:cs/>
+        </w:rPr>
+        <w:t>सच</w:t>
+      </w:r>
+      <w:r>
+        <w:rPr>
+          <w:rFonts w:cs="Mangal"/>
+          <w:b/>
+          <w:bCs/>
+          <w:szCs w:val="24"/>
+          <w:cs/>
+        </w:rPr>
+        <w:t xml:space="preserve"> </w:t>
+      </w:r>
+      <w:r>
+        <w:rPr>
+          <w:rFonts w:cs="Mangal" w:hint="cs"/>
+          <w:b/>
+          <w:bCs/>
+          <w:szCs w:val="24"/>
+          <w:cs/>
+        </w:rPr>
+        <w:t>तो</w:t>
+      </w:r>
+      <w:r>
+        <w:rPr>
+          <w:rFonts w:cs="Mangal"/>
+          <w:b/>
+          <w:bCs/>
+          <w:szCs w:val="24"/>
+          <w:cs/>
+        </w:rPr>
+        <w:t xml:space="preserve"> </w:t>
+      </w:r>
+      <w:r>
+        <w:rPr>
+          <w:rFonts w:cs="Mangal" w:hint="cs"/>
+          <w:b/>
+          <w:bCs/>
+          <w:szCs w:val="24"/>
+          <w:cs/>
+        </w:rPr>
+        <w:t>बनाया</w:t>
+      </w:r>
+      <w:r>
+        <w:rPr>
+          <w:rFonts w:cs="Mangal"/>
+          <w:b/>
+          <w:bCs/>
+          <w:szCs w:val="24"/>
+          <w:cs/>
+        </w:rPr>
+        <w:t xml:space="preserve"> </w:t>
+      </w:r>
+      <w:r>
+        <w:rPr>
+          <w:rFonts w:cs="Mangal" w:hint="cs"/>
+          <w:b/>
+          <w:bCs/>
+          <w:szCs w:val="24"/>
+          <w:cs/>
+        </w:rPr>
+        <w:t>जा</w:t>
+      </w:r>
+      <w:r>
+        <w:rPr>
+          <w:rFonts w:cs="Mangal"/>
+          <w:b/>
+          <w:bCs/>
+          <w:szCs w:val="24"/>
+          <w:cs/>
+        </w:rPr>
+        <w:t xml:space="preserve"> </w:t>
+      </w:r>
+      <w:r>
+        <w:rPr>
+          <w:rFonts w:cs="Mangal" w:hint="cs"/>
+          <w:b/>
+          <w:bCs/>
+          <w:szCs w:val="24"/>
+          <w:cs/>
+        </w:rPr>
+        <w:t>सकता</w:t>
+      </w:r>
+      <w:r>
+        <w:rPr>
+          <w:rFonts w:cs="Mangal"/>
+          <w:b/>
+          <w:bCs/>
+          <w:szCs w:val="24"/>
+          <w:cs/>
+        </w:rPr>
+        <w:t xml:space="preserve"> </w:t>
+      </w:r>
+      <w:r>
+        <w:rPr>
+          <w:rFonts w:cs="Mangal" w:hint="cs"/>
+          <w:b/>
+          <w:bCs/>
+          <w:szCs w:val="24"/>
+          <w:cs/>
+        </w:rPr>
+        <w:t>है</w:t>
+      </w:r>
+      <w:r>
+        <w:rPr>
+          <w:rFonts w:cs="Mangal"/>
+          <w:b/>
+          <w:bCs/>
+          <w:szCs w:val="24"/>
+          <w:cs/>
+        </w:rPr>
+        <w:t xml:space="preserve"> </w:t>
+      </w:r>
+      <w:r>
+        <w:rPr>
+          <w:rFonts w:cs="Mangal" w:hint="cs"/>
+          <w:b/>
+          <w:bCs/>
+          <w:szCs w:val="24"/>
+          <w:cs/>
+        </w:rPr>
+        <w:t>पर</w:t>
+      </w:r>
+      <w:r>
+        <w:rPr>
+          <w:rFonts w:cs="Mangal"/>
+          <w:b/>
+          <w:bCs/>
+          <w:szCs w:val="24"/>
+          <w:cs/>
+        </w:rPr>
+        <w:t xml:space="preserve"> </w:t>
+      </w:r>
+      <w:r>
+        <w:rPr>
+          <w:rFonts w:cs="Mangal" w:hint="cs"/>
+          <w:b/>
+          <w:bCs/>
+          <w:szCs w:val="24"/>
+          <w:cs/>
+        </w:rPr>
+        <w:t>सच</w:t>
+      </w:r>
+      <w:r>
+        <w:rPr>
+          <w:rFonts w:cs="Mangal"/>
+          <w:b/>
+          <w:bCs/>
+          <w:szCs w:val="24"/>
+          <w:cs/>
+        </w:rPr>
+        <w:t xml:space="preserve"> </w:t>
+      </w:r>
+      <w:r>
+        <w:rPr>
+          <w:rFonts w:cs="Mangal" w:hint="cs"/>
+          <w:b/>
+          <w:bCs/>
+          <w:szCs w:val="24"/>
+          <w:cs/>
+        </w:rPr>
+        <w:t>को</w:t>
+      </w:r>
+      <w:r>
+        <w:rPr>
+          <w:rFonts w:cs="Mangal"/>
+          <w:b/>
+          <w:bCs/>
+          <w:szCs w:val="24"/>
+          <w:cs/>
+        </w:rPr>
+        <w:t xml:space="preserve"> </w:t>
+      </w:r>
+      <w:r>
+        <w:rPr>
+          <w:rFonts w:cs="Mangal" w:hint="cs"/>
+          <w:b/>
+          <w:bCs/>
+          <w:szCs w:val="24"/>
+          <w:cs/>
+        </w:rPr>
+        <w:t>झूठ</w:t>
+      </w:r>
+      <w:r>
+        <w:rPr>
+          <w:rFonts w:cs="Mangal"/>
+          <w:b/>
+          <w:bCs/>
+          <w:szCs w:val="24"/>
+          <w:cs/>
+        </w:rPr>
+        <w:t xml:space="preserve"> </w:t>
+      </w:r>
+      <w:r>
+        <w:rPr>
+          <w:rFonts w:cs="Mangal" w:hint="cs"/>
+          <w:b/>
+          <w:bCs/>
+          <w:szCs w:val="24"/>
+          <w:cs/>
+        </w:rPr>
+        <w:t>नहीं</w:t>
+      </w:r>
+      <w:r>
+        <w:rPr>
+          <w:rFonts w:cs="Mangal"/>
+          <w:b/>
+          <w:bCs/>
+          <w:szCs w:val="24"/>
+          <w:cs/>
+        </w:rPr>
+        <w:t xml:space="preserve"> </w:t>
+      </w:r>
+      <w:r>
+        <w:rPr>
+          <w:rFonts w:cs="Mangal" w:hint="cs"/>
+          <w:b/>
+          <w:bCs/>
+          <w:szCs w:val="24"/>
+          <w:cs/>
+        </w:rPr>
+        <w:t>बनाया</w:t>
+      </w:r>
+      <w:r>
+        <w:rPr>
+          <w:rFonts w:cs="Mangal"/>
+          <w:b/>
+          <w:bCs/>
+          <w:szCs w:val="24"/>
+          <w:cs/>
+        </w:rPr>
+        <w:t xml:space="preserve"> </w:t>
+      </w:r>
+      <w:r>
+        <w:rPr>
+          <w:rFonts w:cs="Mangal" w:hint="cs"/>
+          <w:b/>
+          <w:bCs/>
+          <w:szCs w:val="24"/>
+          <w:cs/>
+        </w:rPr>
+        <w:t>जा</w:t>
+      </w:r>
+      <w:r>
+        <w:rPr>
+          <w:rFonts w:cs="Mangal"/>
+          <w:b/>
+          <w:bCs/>
+          <w:szCs w:val="24"/>
+          <w:cs/>
+        </w:rPr>
+        <w:t xml:space="preserve">  </w:t>
+      </w:r>
+      <w:r>
+        <w:rPr>
+          <w:rFonts w:cs="Mangal" w:hint="cs"/>
+          <w:b/>
+          <w:bCs/>
+          <w:szCs w:val="24"/>
+          <w:cs/>
+        </w:rPr>
+        <w:t>सकता</w:t>
+      </w:r>
+      <w:r>
+        <w:rPr>
+          <w:rFonts w:cs="Mangal"/>
+          <w:b/>
+          <w:bCs/>
+          <w:szCs w:val="24"/>
+          <w:cs/>
+        </w:rPr>
+        <w:t xml:space="preserve"> </w:t>
+      </w:r>
+      <w:r>
+        <w:rPr>
+          <w:rFonts w:cs="Mangal" w:hint="cs"/>
+          <w:b/>
+          <w:bCs/>
+          <w:szCs w:val="24"/>
+          <w:cs/>
+        </w:rPr>
+        <w:t>है</w:t>
       </w:r>
     </w:p>
     <w:p>
@@ -1321,6 +1072,367 @@
           <w:szCs w:val="24"/>
           <w:cs/>
         </w:rPr>
+        <w:t xml:space="preserve">और सच यही है </w:t>
+      </w:r>
+      <w:proofErr w:type="spellStart"/>
+      <w:r>
+        <w:rPr>
+          <w:rFonts w:cs="Mangal"/>
+          <w:b/>
+          <w:bCs/>
+          <w:szCs w:val="24"/>
+          <w:cs/>
+        </w:rPr>
+        <w:t>किमिलावट</w:t>
+      </w:r>
+      <w:proofErr w:type="spellEnd"/>
+      <w:r>
+        <w:rPr>
+          <w:rFonts w:cs="Mangal"/>
+          <w:b/>
+          <w:bCs/>
+          <w:szCs w:val="24"/>
+          <w:cs/>
+        </w:rPr>
+        <w:t xml:space="preserve"> के बिना जिंदगी </w:t>
+      </w:r>
+      <w:proofErr w:type="spellStart"/>
+      <w:r>
+        <w:rPr>
+          <w:rFonts w:cs="Mangal"/>
+          <w:b/>
+          <w:bCs/>
+          <w:szCs w:val="24"/>
+          <w:cs/>
+        </w:rPr>
+        <w:t>जिंदगी</w:t>
+      </w:r>
+      <w:proofErr w:type="spellEnd"/>
+      <w:r>
+        <w:rPr>
+          <w:rFonts w:cs="Mangal"/>
+          <w:b/>
+          <w:bCs/>
+          <w:szCs w:val="24"/>
+          <w:cs/>
+        </w:rPr>
+        <w:t xml:space="preserve"> नहीं मिलावट के बिना इम्यूनिटी </w:t>
+      </w:r>
+      <w:proofErr w:type="spellStart"/>
+      <w:r>
+        <w:rPr>
+          <w:rFonts w:cs="Mangal"/>
+          <w:b/>
+          <w:bCs/>
+          <w:szCs w:val="24"/>
+          <w:cs/>
+        </w:rPr>
+        <w:t>इम्यूनिटी</w:t>
+      </w:r>
+      <w:proofErr w:type="spellEnd"/>
+      <w:r>
+        <w:rPr>
+          <w:rFonts w:cs="Mangal"/>
+          <w:b/>
+          <w:bCs/>
+          <w:szCs w:val="24"/>
+          <w:cs/>
+        </w:rPr>
+        <w:t xml:space="preserve"> </w:t>
+      </w:r>
+      <w:proofErr w:type="spellStart"/>
+      <w:r>
+        <w:rPr>
+          <w:rFonts w:cs="Mangal"/>
+          <w:b/>
+          <w:bCs/>
+          <w:szCs w:val="24"/>
+          <w:cs/>
+        </w:rPr>
+        <w:t>नहींबॉडी</w:t>
+      </w:r>
+      <w:proofErr w:type="spellEnd"/>
+      <w:r>
+        <w:rPr>
+          <w:rFonts w:cs="Mangal"/>
+          <w:b/>
+          <w:bCs/>
+          <w:szCs w:val="24"/>
+          <w:cs/>
+        </w:rPr>
+        <w:t xml:space="preserve"> के बिना बॉडी </w:t>
+      </w:r>
+      <w:proofErr w:type="spellStart"/>
+      <w:r>
+        <w:rPr>
+          <w:rFonts w:cs="Mangal"/>
+          <w:b/>
+          <w:bCs/>
+          <w:szCs w:val="24"/>
+          <w:cs/>
+        </w:rPr>
+        <w:t>बॉडी</w:t>
+      </w:r>
+      <w:proofErr w:type="spellEnd"/>
+      <w:r>
+        <w:rPr>
+          <w:rFonts w:cs="Mangal"/>
+          <w:b/>
+          <w:bCs/>
+          <w:szCs w:val="24"/>
+          <w:cs/>
+        </w:rPr>
+        <w:t xml:space="preserve"> </w:t>
+      </w:r>
+      <w:proofErr w:type="spellStart"/>
+      <w:r>
+        <w:rPr>
+          <w:rFonts w:cs="Mangal"/>
+          <w:b/>
+          <w:bCs/>
+          <w:szCs w:val="24"/>
+          <w:cs/>
+        </w:rPr>
+        <w:t>नहींचाहे</w:t>
+      </w:r>
+      <w:proofErr w:type="spellEnd"/>
+      <w:r>
+        <w:rPr>
+          <w:rFonts w:cs="Mangal"/>
+          <w:b/>
+          <w:bCs/>
+          <w:szCs w:val="24"/>
+          <w:cs/>
+        </w:rPr>
+        <w:t xml:space="preserve"> वह फिर गधे की हो या आदमी </w:t>
+      </w:r>
+      <w:proofErr w:type="spellStart"/>
+      <w:r>
+        <w:rPr>
+          <w:rFonts w:cs="Mangal"/>
+          <w:b/>
+          <w:bCs/>
+          <w:szCs w:val="24"/>
+          <w:cs/>
+        </w:rPr>
+        <w:t>कीचींटी</w:t>
+      </w:r>
+      <w:proofErr w:type="spellEnd"/>
+      <w:r>
+        <w:rPr>
+          <w:rFonts w:cs="Mangal"/>
+          <w:b/>
+          <w:bCs/>
+          <w:szCs w:val="24"/>
+          <w:cs/>
+        </w:rPr>
+        <w:t xml:space="preserve"> की हो या फिर हाथी </w:t>
+      </w:r>
+      <w:proofErr w:type="spellStart"/>
+      <w:r>
+        <w:rPr>
+          <w:rFonts w:cs="Mangal"/>
+          <w:b/>
+          <w:bCs/>
+          <w:szCs w:val="24"/>
+          <w:cs/>
+        </w:rPr>
+        <w:t>कीएंटीबॉडीज</w:t>
+      </w:r>
+      <w:proofErr w:type="spellEnd"/>
+      <w:r>
+        <w:rPr>
+          <w:rFonts w:cs="Mangal"/>
+          <w:b/>
+          <w:bCs/>
+          <w:szCs w:val="24"/>
+          <w:cs/>
+        </w:rPr>
+        <w:t xml:space="preserve"> है तो बॉडी है</w:t>
+      </w:r>
+      <w:r>
+        <w:rPr>
+          <w:rFonts w:ascii="Arial" w:hAnsi="Arial" w:cs="Arial" w:hint="cs"/>
+          <w:b/>
+          <w:bCs/>
+          <w:szCs w:val="24"/>
+          <w:cs/>
+        </w:rPr>
+        <w:t>”</w:t>
+      </w:r>
+      <w:r>
+        <w:rPr>
+          <w:rFonts w:cs="Mangal"/>
+          <w:b/>
+          <w:bCs/>
+          <w:szCs w:val="24"/>
+          <w:cs/>
+        </w:rPr>
+        <w:t>(</w:t>
+      </w:r>
+      <w:r>
+        <w:rPr>
+          <w:rFonts w:cs="Mangal" w:hint="cs"/>
+          <w:b/>
+          <w:bCs/>
+          <w:szCs w:val="24"/>
+          <w:cs/>
+        </w:rPr>
+        <w:t>पृ</w:t>
+      </w:r>
+      <w:r>
+        <w:rPr>
+          <w:rFonts w:cs="Mangal"/>
+          <w:b/>
+          <w:bCs/>
+          <w:szCs w:val="24"/>
+          <w:cs/>
+        </w:rPr>
+        <w:t>.</w:t>
+      </w:r>
+      <w:r>
+        <w:rPr>
+          <w:rFonts w:cs="Mangal" w:hint="cs"/>
+          <w:b/>
+          <w:bCs/>
+          <w:szCs w:val="24"/>
+          <w:cs/>
+        </w:rPr>
+        <w:t>क्र</w:t>
+      </w:r>
+      <w:r>
+        <w:rPr>
+          <w:rFonts w:cs="Mangal"/>
+          <w:b/>
+          <w:bCs/>
+          <w:szCs w:val="24"/>
+          <w:cs/>
+        </w:rPr>
+        <w:t>.</w:t>
+      </w:r>
+      <w:r>
+        <w:rPr>
+          <w:rFonts w:cs="Mangal" w:hint="cs"/>
+          <w:b/>
+          <w:bCs/>
+          <w:szCs w:val="24"/>
+          <w:cs/>
+        </w:rPr>
+        <w:t>६९</w:t>
+      </w:r>
+      <w:r>
+        <w:rPr>
+          <w:rFonts w:cs="Mangal"/>
+          <w:b/>
+          <w:bCs/>
+          <w:szCs w:val="24"/>
+          <w:cs/>
+        </w:rPr>
+        <w:t>)</w:t>
+      </w:r>
+    </w:p>
+    <w:p>
+      <w:pPr>
+        <w:spacing w:after="0"/>
+        <w:jc w:val="both"/>
+      </w:pPr>
+      <w:r>
+        <w:rPr>
+          <w:rFonts w:ascii="Mangal" w:hAnsi="Mangal" w:cs="Mangal" w:eastAsia="Mangal"/>
+          <w:b/>
+          <w:sz w:val="24"/>
+        </w:rPr>
+        <w:t>पंक्तियों की व्यंग्यात्मकता को विस्तृत रूप में स्पष्ट कीजिए</w:t>
+      </w:r>
+    </w:p>
+    <w:p>
+      <w:pPr>
+        <w:spacing w:after="0"/>
+        <w:jc w:val="both"/>
+      </w:pPr>
+      <w:r>
+        <w:rPr>
+          <w:rFonts w:ascii="Mangal" w:hAnsi="Mangal" w:cs="Mangal" w:eastAsia="Mangal"/>
+          <w:b w:val="0"/>
+          <w:sz w:val="24"/>
+        </w:rPr>
+        <w:t>मिलावटखोर “सच” की पुनरावृत्ति करके अपने स्वार्थ को निर्विवाद तथ्य जैसा दिखाता है। टीकों के मिश्रण की चर्चा को खाने-पीने की वस्तुओं में मिलावट के समर्थन में खींच लाना असंगत तुलना है। गधे से हाथी तक “बॉडी” और “एंटीबॉडीज” का खेल तर्क का हास्यास्पद विस्तार है; इससे लेखक दिखाते हैं कि विज्ञान की भाषा को कैसे अपने लाभ के लिए तोड़ा-मरोड़ा जा सकता है।</w:t>
+      </w:r>
+    </w:p>
+    <w:p>
+      <w:pPr>
+        <w:spacing w:after="0"/>
+        <w:jc w:val="both"/>
+      </w:pPr>
+      <w:r>
+        <w:rPr>
+          <w:rFonts w:ascii="Mangal" w:hAnsi="Mangal" w:cs="Mangal" w:eastAsia="Mangal"/>
+          <w:b/>
+          <w:sz w:val="24"/>
+        </w:rPr>
+        <w:t>इसमें मुख्य व्यंग्य कौन-सा है?</w:t>
+      </w:r>
+    </w:p>
+    <w:p>
+      <w:pPr>
+        <w:spacing w:after="0"/>
+        <w:jc w:val="both"/>
+      </w:pPr>
+      <w:r>
+        <w:rPr>
+          <w:rFonts w:ascii="Mangal" w:hAnsi="Mangal" w:cs="Mangal" w:eastAsia="Mangal"/>
+          <w:b w:val="0"/>
+          <w:sz w:val="24"/>
+        </w:rPr>
+        <w:t>मुख्य व्यंग्य मिलावट को स्वास्थ्य और जनहित बताकर बेचने वाले व्यापारी तथा वैज्ञानिक निष्कर्षों का गलत अर्थ निकालने की प्रवृत्ति पर है।</w:t>
+      </w:r>
+    </w:p>
+    <w:p>
+      <w:pPr>
+        <w:spacing w:after="0"/>
+        <w:jc w:val="both"/>
+      </w:pPr>
+      <w:r>
+        <w:rPr>
+          <w:rFonts w:ascii="Mangal" w:hAnsi="Mangal" w:cs="Mangal" w:eastAsia="Mangal"/>
+          <w:b/>
+          <w:sz w:val="24"/>
+        </w:rPr>
+        <w:t>लेखक क्या परिवर्तन चाहते हैं?</w:t>
+      </w:r>
+    </w:p>
+    <w:p>
+      <w:pPr>
+        <w:spacing w:after="0"/>
+        <w:jc w:val="both"/>
+      </w:pPr>
+      <w:r>
+        <w:rPr>
+          <w:rFonts w:ascii="Mangal" w:hAnsi="Mangal" w:cs="Mangal" w:eastAsia="Mangal"/>
+          <w:b w:val="0"/>
+          <w:sz w:val="24"/>
+        </w:rPr>
+        <w:t>लेखक चाहते हैं कि खाद्य पदार्थों में शुद्धता और सुरक्षा सुनिश्चित हो, वैज्ञानिक जानकारी का जिम्मेदारी से उपयोग किया जाए और मुनाफे को जनहित का मुखौटा न पहनाया जाए।</w:t>
+      </w:r>
+    </w:p>
+    <w:p>
+      <w:pPr>
+        <w:jc w:val="center"/>
+        <w:rPr>
+          <w:rFonts w:cs="Mangal"/>
+          <w:b/>
+          <w:bCs/>
+          <w:szCs w:val="24"/>
+        </w:rPr>
+      </w:pPr>
+      <w:r>
+        <w:rPr>
+          <w:rFonts w:cs="Mangal"/>
+          <w:b/>
+          <w:bCs/>
+          <w:szCs w:val="24"/>
+          <w:cs/>
+        </w:rPr>
         <w:t>२.</w:t>
       </w:r>
       <w:r>
@@ -2880,6 +2992,90 @@
           <w:cs/>
         </w:rPr>
         <w:t>)</w:t>
+      </w:r>
+    </w:p>
+    <w:p>
+      <w:pPr>
+        <w:spacing w:after="0"/>
+        <w:jc w:val="both"/>
+      </w:pPr>
+      <w:r>
+        <w:rPr>
+          <w:rFonts w:ascii="Mangal" w:hAnsi="Mangal" w:cs="Mangal" w:eastAsia="Mangal"/>
+          <w:b/>
+          <w:sz w:val="24"/>
+        </w:rPr>
+        <w:t>पंक्तियों की व्यंग्यात्मकता को विस्तृत रूप में स्पष्ट कीजिए</w:t>
+      </w:r>
+    </w:p>
+    <w:p>
+      <w:pPr>
+        <w:spacing w:after="0"/>
+        <w:jc w:val="both"/>
+      </w:pPr>
+      <w:r>
+        <w:rPr>
+          <w:rFonts w:ascii="Mangal" w:hAnsi="Mangal" w:cs="Mangal" w:eastAsia="Mangal"/>
+          <w:b w:val="0"/>
+          <w:sz w:val="24"/>
+        </w:rPr>
+        <w:t>दूध, मसालों और आटे में मिलावट के उदाहरणों को “देश की इम्युनिटी” बढ़ाने का चमत्कार बताना उलटी प्रशंसा है। थाली बजाने और दीप जलाने के प्रसंग को मिलावट से जोड़कर लेखक झूठे तर्क और दिखावटी राष्ट्रसेवा की खिल्ली उड़ाते हैं। पाठक जानता है कि मिलावट स्वास्थ्य को नुकसान पहुँचाती है; इसलिए वक्ता का आत्मविश्वास ही विडंबना बन जाता है।</w:t>
+      </w:r>
+    </w:p>
+    <w:p>
+      <w:pPr>
+        <w:spacing w:after="0"/>
+        <w:jc w:val="both"/>
+      </w:pPr>
+      <w:r>
+        <w:rPr>
+          <w:rFonts w:ascii="Mangal" w:hAnsi="Mangal" w:cs="Mangal" w:eastAsia="Mangal"/>
+          <w:b/>
+          <w:sz w:val="24"/>
+        </w:rPr>
+        <w:t>इसमें मुख्य व्यंग्य कौन-सा है?</w:t>
+      </w:r>
+    </w:p>
+    <w:p>
+      <w:pPr>
+        <w:spacing w:after="0"/>
+        <w:jc w:val="both"/>
+      </w:pPr>
+      <w:r>
+        <w:rPr>
+          <w:rFonts w:ascii="Mangal" w:hAnsi="Mangal" w:cs="Mangal" w:eastAsia="Mangal"/>
+          <w:b w:val="0"/>
+          <w:sz w:val="24"/>
+        </w:rPr>
+        <w:t>मुख्य व्यंग्य मिलावटखोरों की उस ढिठाई पर है जो अपराध को देशभक्ति और उपभोक्ता-हित बताकर पेश करती है। वास्तविक लाभ व्यापारी का है, लेकिन भाषा में चिंता जनता की दिखाई जाती है।</w:t>
+      </w:r>
+    </w:p>
+    <w:p>
+      <w:pPr>
+        <w:spacing w:after="0"/>
+        <w:jc w:val="both"/>
+      </w:pPr>
+      <w:r>
+        <w:rPr>
+          <w:rFonts w:ascii="Mangal" w:hAnsi="Mangal" w:cs="Mangal" w:eastAsia="Mangal"/>
+          <w:b/>
+          <w:sz w:val="24"/>
+        </w:rPr>
+        <w:t>लेखक क्या परिवर्तन चाहते हैं?</w:t>
+      </w:r>
+    </w:p>
+    <w:p>
+      <w:pPr>
+        <w:spacing w:after="0"/>
+        <w:jc w:val="both"/>
+      </w:pPr>
+      <w:r>
+        <w:rPr>
+          <w:rFonts w:ascii="Mangal" w:hAnsi="Mangal" w:cs="Mangal" w:eastAsia="Mangal"/>
+          <w:b w:val="0"/>
+          <w:sz w:val="24"/>
+        </w:rPr>
+        <w:t>लेखक सुरक्षित खाद्य-वस्तुओं, ईमानदार व्यापार और प्रभावी निगरानी की अपेक्षा करते हैं। नागरिकों को भी ऐसे दावों पर विवेकपूर्ण सवाल उठाने चाहिए।</w:t>
       </w:r>
     </w:p>
     <w:p>

</xml_diff>